<commit_message>
Sync docs canon reconciliation backport from fates-edge-docs
Pulls in the docs-side rules-canon reconciliation: bestiary.json and
adventure JSON migrated to schema v2 (adversary attributes/skills/dice
pools removed; Harm/Fatigue/Armor-Step/Resilience added), and the First
Play Kit DOCX/PDF updated for the Reaction mechanic and Effect-as-
narrative-tag. Manifests regenerated via generate-manifests.js.

Co-Authored-By: Claude Sonnet 5 <noreply@anthropic.com>
Claude-Session: https://claude.ai/code/session_01Q9rkneEXn3myzeJsbovVbK
</commit_message>
<xml_diff>
--- a/utilities/javascript/fates-edge-web-client/data/docs/resources/Fates_-_Edge_-_-First-_-Play-_-Kit.docx
+++ b/utilities/javascript/fates-edge-web-client/data/docs/resources/Fates_-_Edge_-_-First-_-Play-_-Kit.docx
@@ -1009,7 +1009,7 @@
         <w:rPr>
           <w:rFonts w:ascii="Aptos" w:hAnsi="Aptos"/>
         </w:rPr>
-        <w:t>Position stops at Dominant and Desperate. If another advantage applies at Dominant, the GM may lower DV, increase Effect, or simply say yes.</w:t>
+        <w:t>Position stops at Dominant and Desperate. If another advantage applies at Dominant, the GM may lower DV, grant an extra Boon, or simply say yes.</w:t>
       </w:r>
     </w:p>
     <w:p>
@@ -6150,7 +6150,7 @@
         <w:rPr>
           <w:rFonts w:ascii="Aptos" w:hAnsi="Aptos"/>
         </w:rPr>
-        <w:t>Weapon Master Warhammer: plus 2 dice with the warhammer; once per scene increase its Effect by one step.</w:t>
+        <w:t>Weapon Master Warhammer: plus 2 dice with the warhammer; once per scene, a hit with it deals +1 Harm.</w:t>
       </w:r>
     </w:p>
     <w:p>
@@ -10896,7 +10896,7 @@
     </w:p>
     <w:p>
       <w:r>
-        <w:t>Use the usual player outcome matrix: meeting DV achieves the declared intent; a Partial makes the declared lesser progress; a Miss makes none. Apply any stated consequence through that outcome and the relevant SB procedure. A successful defense avoids the threatened hit; it does not deal retaliatory weapon Harm unless that was the declared action. A Partial defense uses the lesser protection agreed before the roll. Never charge damage twice for one consequence.</w:t>
+        <w:t>Use the usual player outcome matrix: meeting DV achieves the declared intent; a Partial makes the declared lesser progress; a Miss makes none. Apply any stated consequence through that outcome and the relevant SB procedure. Each PC has 1 Reaction per turn to spend rolling a defense test against a threatened hit; DV equals that hit’s Harm. A spent Reaction returns next turn, or immediately for 1 Boon. If no Reaction is spent, the hit lands passively: apply its stated Harm straight through Armor conversion, no roll either side. Defensive Talents (Counterspell, Intercept, and similar) are passive and do not draw from the Reaction pool. A successful Reaction avoids the threatened hit; it does not deal retaliatory weapon Harm unless that was the declared action. A Partial Reaction uses the lesser protection agreed before the roll. Never charge damage twice for one consequence.</w:t>
       </w:r>
     </w:p>
     <w:p>
@@ -10935,7 +10935,7 @@
     </w:p>
     <w:p>
       <w:r>
-        <w:t>A successful Setup gives the next action +1 Position or a step up in Effect, not +1 die. Use the strongest applicable Setup benefit for one action; repeated Setups do not stack numeric benefits. A Setup roll counts toward the scene’s action allowance. Assist is separate: spend 1 Boon for +1 die and share the risk, within the pool cap. Do not roll safe repetition to farm resources.</w:t>
+        <w:t>A successful Setup gives the next action +1 Position, not +1 die, and does not draw from Assist’s dice-pool cap. Repeated Setups do not stack. A Setup roll counts toward the scene’s action allowance. Assist is separate: spend 1 Boon for +1 die and share the risk, within the pool cap (Setup does not count against this cap). Do not roll safe repetition to farm resources.</w:t>
       </w:r>
     </w:p>
     <w:p>
@@ -10948,7 +10948,7 @@
     </w:p>
     <w:p>
       <w:r>
-        <w:t>The GM spends 1 SB on a fresh Knife attack and describes a slash toward Lyra. Lyra tries to slip behind a dye vat. Agree Controlled, DV 3; success reaches cover without the hit, a Partial reaches cover but takes Harm 1, and a Miss leaves her exposed with the Knife’s Harm 1. Lyra alone rolls. Her Armor resolves any incoming Harm normally. The GM banks her 1s but spends them only after this response resolves. The SB that bought the attack cannot also pay a named follow-up move.</w:t>
+        <w:t>The GM spends 1 SB on a fresh Knife attack (Harm 1) and describes a slash toward Lyra. Lyra spends her Reaction to slip behind a dye vat: DV equals the Knife’s Harm, 1. Success reaches cover without the hit, a Partial reaches cover but still takes Harm 1, and a Miss leaves her exposed to the full Harm 1. Lyra alone rolls. Her Armor resolves any incoming Harm normally. The GM banks her 1s but spends them only after this response resolves. The SB that bought the attack cannot also pay a named follow-up move.</w:t>
       </w:r>
     </w:p>
     <w:p>

</xml_diff>